<commit_message>
docs: align deliverables with hospital login contract
</commit_message>
<xml_diff>
--- a/docs/Agnos_Development_Planning.docx
+++ b/docs/Agnos_Development_Planning.docx
@@ -374,7 +374,7 @@
         </w:numPr>
       </w:pPr>
       <w:r>
-        <w:t>Staff usernames are globally unique because login accepts only username and password.</w:t>
+        <w:t>Staff usernames remain globally unique. Login requires username, password, and hospital; the normalized hospital must match the staff account.</w:t>
       </w:r>
     </w:p>
     <w:p>
@@ -1533,7 +1533,7 @@
     </w:p>
     <w:p>
       <w:r>
-        <w:t>Authenticates a globally unique username and returns a hospital-scoped JWT.</w:t>
+        <w:t>Authenticates staff credentials for the supplied hospital and returns a hospital-scoped JWT.</w:t>
       </w:r>
     </w:p>
     <w:p>
@@ -1549,7 +1549,7 @@
         </w:rPr>
         <w:t>Request</w:t>
         <w:br/>
-        <w:t>{"username":"doctor.one","password":"correct-horse-battery"}</w:t>
+        <w:t>{"username":"doctor.one","password":"correct-horse-battery","hospital":"hospital-a"}</w:t>
         <w:br/>
         <w:br/>
         <w:t>200 OK</w:t>
@@ -1559,7 +1559,7 @@
     </w:p>
     <w:p>
       <w:r>
-        <w:t>Errors: 400 invalid_request, 401 unauthorized, 500 internal_error. Unknown user and wrong password intentionally return the same 401 response.</w:t>
+        <w:t>Errors: 400 invalid_request, 401 unauthorized, 500 internal_error. Invalid username, password, and hospital combinations intentionally return the same 401 response.</w:t>
       </w:r>
     </w:p>
     <w:p>
@@ -2755,7 +2755,7 @@
     </w:p>
     <w:p>
       <w:r>
-        <w:t>Authentication record. username is globally unique; password_hash stores bcrypt output; hospital_id is immutable in the authentication context.</w:t>
+        <w:t>Authentication record. username is globally unique; password_hash stores bcrypt output; hospital_id is immutable in the authentication context. Login also requires the matching hospital code.</w:t>
       </w:r>
     </w:p>
     <w:p>
@@ -3397,10 +3397,10 @@
           <w:color w:val="000000"/>
           <w:sz w:val="22"/>
         </w:rPr>
-        <w:t>Environment limitation.</w:t>
+        <w:t>Runtime verification.</w:t>
       </w:r>
       <w:r>
-        <w:t xml:space="preserve"> Docker/Nginx runtime validation was not available on the current host. Race detection requires CGO and a C compiler, neither of which is installed. Run docker compose config, docker compose up --build, nginx -t, and go test -race ./... in CI or a Docker-capable review environment.</w:t>
+        <w:t xml:space="preserve"> Docker Compose configuration, image build, Nginx routing, PostgreSQL persistence, staff authentication, hospital isolation, and API validation pass through scripts/smoke-test.sh. GitHub Actions also runs race detection, vet, and the application build.</w:t>
       </w:r>
     </w:p>
     <w:p>

</xml_diff>